<commit_message>
Database schema diagram added
</commit_message>
<xml_diff>
--- a/E Governance Design Document.docx
+++ b/E Governance Design Document.docx
@@ -1649,8 +1649,44 @@
           <w:u w:val="single"/>
           <w:lang w:val="en-US"/>
         </w:rPr>
-        <w:t>DESIGN:</w:t>
+        <w:t>DB SCHEMA</w:t>
       </w:r>
+    </w:p>
+    <w:p>
+      <w:pPr>
+        <w:ind w:firstLine="110" w:firstLineChars="50"/>
+        <w:rPr>
+          <w:rFonts w:hint="default"/>
+          <w:b/>
+          <w:bCs/>
+          <w:u w:val="single"/>
+          <w:lang w:val="en-US"/>
+        </w:rPr>
+      </w:pPr>
+    </w:p>
+    <w:p>
+      <w:pPr>
+        <w:ind w:firstLine="110" w:firstLineChars="50"/>
+        <w:rPr>
+          <w:rFonts w:hint="default"/>
+          <w:b/>
+          <w:bCs/>
+          <w:u w:val="single"/>
+          <w:lang w:val="en-US"/>
+        </w:rPr>
+      </w:pPr>
+    </w:p>
+    <w:p>
+      <w:pPr>
+        <w:ind w:firstLine="110" w:firstLineChars="50"/>
+        <w:rPr>
+          <w:rFonts w:hint="default"/>
+          <w:b/>
+          <w:bCs/>
+          <w:u w:val="single"/>
+          <w:lang w:val="en-US"/>
+        </w:rPr>
+      </w:pPr>
     </w:p>
     <w:p>
       <w:pPr>
@@ -1667,9 +1703,9 @@
         </w:rPr>
         <w:drawing>
           <wp:inline distT="0" distB="0" distL="114300" distR="114300">
-            <wp:extent cx="5601335" cy="7627620"/>
-            <wp:effectExtent l="0" t="0" r="6985" b="7620"/>
-            <wp:docPr id="4" name="Picture 4" descr="Design.drawio"/>
+            <wp:extent cx="5926455" cy="4948555"/>
+            <wp:effectExtent l="0" t="0" r="1905" b="4445"/>
+            <wp:docPr id="1" name="Picture 1" descr="DBSchema"/>
             <wp:cNvGraphicFramePr>
               <a:graphicFrameLocks xmlns:a="http://schemas.openxmlformats.org/drawingml/2006/main" noChangeAspect="1"/>
             </wp:cNvGraphicFramePr>
@@ -1677,7 +1713,7 @@
               <a:graphicData uri="http://schemas.openxmlformats.org/drawingml/2006/picture">
                 <pic:pic xmlns:pic="http://schemas.openxmlformats.org/drawingml/2006/picture">
                   <pic:nvPicPr>
-                    <pic:cNvPr id="4" name="Picture 4" descr="Design.drawio"/>
+                    <pic:cNvPr id="1" name="Picture 1" descr="DBSchema"/>
                     <pic:cNvPicPr>
                       <a:picLocks noChangeAspect="1"/>
                     </pic:cNvPicPr>
@@ -1691,7 +1727,7 @@
                   <pic:spPr>
                     <a:xfrm>
                       <a:off x="0" y="0"/>
-                      <a:ext cx="5601335" cy="7627620"/>
+                      <a:ext cx="5926455" cy="4948555"/>
                     </a:xfrm>
                     <a:prstGeom prst="rect">
                       <a:avLst/>
@@ -1703,6 +1739,8 @@
           </wp:inline>
         </w:drawing>
       </w:r>
+      <w:bookmarkStart w:id="11" w:name="_GoBack"/>
+      <w:bookmarkEnd w:id="11"/>
     </w:p>
     <w:p>
       <w:pPr>
@@ -1717,12 +1755,6 @@
       <w:pPr>
         <w:pStyle w:val="2"/>
         <w:bidi w:val="0"/>
-        <w:rPr>
-          <w:rFonts w:hint="default"/>
-          <w:lang w:val="en-US" w:eastAsia="zh-CN"/>
-        </w:rPr>
-      </w:pPr>
-      <w:r>
         <w:rPr>
           <w:rFonts w:hint="default"/>
           <w:b/>
@@ -1730,6 +1762,93 @@
           <w:u w:val="single"/>
           <w:lang w:val="en-US" w:eastAsia="zh-CN"/>
         </w:rPr>
+      </w:pPr>
+    </w:p>
+    <w:p>
+      <w:pPr>
+        <w:pStyle w:val="2"/>
+        <w:bidi w:val="0"/>
+        <w:rPr>
+          <w:rFonts w:hint="default"/>
+          <w:b/>
+          <w:bCs/>
+          <w:u w:val="single"/>
+          <w:lang w:val="en-US" w:eastAsia="zh-CN"/>
+        </w:rPr>
+      </w:pPr>
+    </w:p>
+    <w:p>
+      <w:pPr>
+        <w:rPr>
+          <w:rFonts w:hint="default"/>
+          <w:b/>
+          <w:bCs/>
+          <w:u w:val="single"/>
+          <w:lang w:val="en-US" w:eastAsia="zh-CN"/>
+        </w:rPr>
+      </w:pPr>
+    </w:p>
+    <w:p>
+      <w:pPr>
+        <w:rPr>
+          <w:rFonts w:hint="default"/>
+          <w:b/>
+          <w:bCs/>
+          <w:u w:val="single"/>
+          <w:lang w:val="en-US" w:eastAsia="zh-CN"/>
+        </w:rPr>
+      </w:pPr>
+    </w:p>
+    <w:p>
+      <w:pPr>
+        <w:rPr>
+          <w:rFonts w:hint="default"/>
+          <w:b/>
+          <w:bCs/>
+          <w:u w:val="single"/>
+          <w:lang w:val="en-US" w:eastAsia="zh-CN"/>
+        </w:rPr>
+      </w:pPr>
+    </w:p>
+    <w:p>
+      <w:pPr>
+        <w:rPr>
+          <w:rFonts w:hint="default"/>
+          <w:b/>
+          <w:bCs/>
+          <w:u w:val="single"/>
+          <w:lang w:val="en-US" w:eastAsia="zh-CN"/>
+        </w:rPr>
+      </w:pPr>
+    </w:p>
+    <w:p>
+      <w:pPr>
+        <w:rPr>
+          <w:rFonts w:hint="default"/>
+          <w:b/>
+          <w:bCs/>
+          <w:u w:val="single"/>
+          <w:lang w:val="en-US" w:eastAsia="zh-CN"/>
+        </w:rPr>
+      </w:pPr>
+    </w:p>
+    <w:p>
+      <w:pPr>
+        <w:pStyle w:val="2"/>
+        <w:bidi w:val="0"/>
+        <w:rPr>
+          <w:rFonts w:hint="default"/>
+          <w:lang w:val="en-US" w:eastAsia="zh-CN"/>
+        </w:rPr>
+      </w:pPr>
+      <w:r>
+        <w:rPr>
+          <w:rFonts w:hint="default"/>
+          <w:b/>
+          <w:bCs/>
+          <w:u w:val="single"/>
+          <w:lang w:val="en-US" w:eastAsia="zh-CN"/>
+        </w:rPr>
         <w:t>HLD DESIGN:</w:t>
       </w:r>
     </w:p>
@@ -1799,8 +1918,8 @@
         </w:rPr>
         <w:drawing>
           <wp:inline distT="0" distB="0" distL="114300" distR="114300">
-            <wp:extent cx="6158230" cy="4150995"/>
-            <wp:effectExtent l="0" t="0" r="13970" b="9525"/>
+            <wp:extent cx="6411595" cy="4150995"/>
+            <wp:effectExtent l="0" t="0" r="4445" b="9525"/>
             <wp:docPr id="3" name="Picture 3" descr="IMG_256"/>
             <wp:cNvGraphicFramePr>
               <a:graphicFrameLocks xmlns:a="http://schemas.openxmlformats.org/drawingml/2006/main" noChangeAspect="1"/>
@@ -1823,7 +1942,7 @@
                   <pic:spPr>
                     <a:xfrm>
                       <a:off x="0" y="0"/>
-                      <a:ext cx="6158230" cy="4150995"/>
+                      <a:ext cx="6411595" cy="4150995"/>
                     </a:xfrm>
                     <a:prstGeom prst="rect">
                       <a:avLst/>
@@ -2041,7 +2160,6 @@
           <w:lang w:val="en-US"/>
         </w:rPr>
       </w:pPr>
-      <w:bookmarkStart w:id="11" w:name="_GoBack"/>
       <w:r>
         <w:rPr>
           <w:rFonts w:hint="default"/>
@@ -2085,7 +2203,6 @@
           </wp:inline>
         </w:drawing>
       </w:r>
-      <w:bookmarkEnd w:id="11"/>
     </w:p>
     <w:p/>
     <w:p>

</xml_diff>